<commit_message>
Remove foundation check introduction
</commit_message>
<xml_diff>
--- a/exam1/diagnostic/questions.docx
+++ b/exam1/diagnostic/questions.docx
@@ -8,24 +8,6 @@
       </w:pPr>
       <w:r>
         <w:t>Exam 1 foundation check</w:t>
-      </w:r>
-    </w:p>
-    <w:p>
-      <w:pPr>
-        <w:keepNext/>
-        <w:keepLines/>
-      </w:pPr>
-      <w:r>
-        <w:t>Find what to review before you start. This four-page check is practice, not a grade or an exam prediction.</w:t>
-      </w:r>
-    </w:p>
-    <w:p>
-      <w:pPr>
-        <w:keepNext/>
-        <w:keepLines/>
-      </w:pPr>
-      <w:r>
-        <w:t>Try questions 1 to 13 without notes, including page 4. All efficiency questions ask for worst-case costs. Use pseudocode for sorting; Python syntax is not required there. Mark confidence as sure, unsure, or guessed. Aim for 22 minutes in class. Speed is not scored.</w:t>
       </w:r>
     </w:p>
     <w:p>

</xml_diff>

<commit_message>
Remove TA-only study materials
</commit_message>
<xml_diff>
--- a/exam1/diagnostic/questions.docx
+++ b/exam1/diagnostic/questions.docx
@@ -1316,7 +1316,7 @@
         <w:keepLines/>
       </w:pPr>
       <w:r>
-        <w:t xml:space="preserve">Next: open </w:t>
+        <w:t xml:space="preserve">Next: check </w:t>
       </w:r>
       <w:hyperlink r:id="rId10">
         <w:r>
@@ -1327,7 +1327,7 @@
         </w:r>
       </w:hyperlink>
       <w:r>
-        <w:t xml:space="preserve"> when your TA asks. Review a flagged concept, then try a fresh question without notes.</w:t>
+        <w:t xml:space="preserve"> after your attempt. Review a flagged concept, then try a fresh question without notes.</w:t>
       </w:r>
     </w:p>
     <w:sectPr>

</xml_diff>